<commit_message>
worked through r course
</commit_message>
<xml_diff>
--- a/Study R/R Vocabulary.docx
+++ b/Study R/R Vocabulary.docx
@@ -19,15 +19,7 @@
     </w:p>
     <w:p>
       <w:r>
-        <w:t xml:space="preserve">We will end each chapter with a list of important functions that you should try to know by heart. In this chapter this will be a long list, but most of these functions are very intuitive and as they will be used throughout this </w:t>
-      </w:r>
-      <w:proofErr w:type="gramStart"/>
-      <w:r>
-        <w:t>course</w:t>
-      </w:r>
-      <w:proofErr w:type="gramEnd"/>
-      <w:r>
-        <w:t xml:space="preserve"> they are likely to become internalised quickly.</w:t>
+        <w:t>We will end each chapter with a list of important functions that you should try to know by heart. In this chapter this will be a long list, but most of these functions are very intuitive and as they will be used throughout this course they are likely to become internalised quickly.</w:t>
       </w:r>
     </w:p>
     <w:p>
@@ -800,15 +792,7 @@
           </w:tcPr>
           <w:p>
             <w:r>
-              <w:t xml:space="preserve">number of </w:t>
-            </w:r>
-            <w:proofErr w:type="gramStart"/>
-            <w:r>
-              <w:t>character</w:t>
-            </w:r>
-            <w:proofErr w:type="gramEnd"/>
-            <w:r>
-              <w:t xml:space="preserve"> in a string</w:t>
+              <w:t>number of character in a string</w:t>
             </w:r>
           </w:p>
         </w:tc>
@@ -915,12 +899,10 @@
               <w:t xml:space="preserve">is.na, </w:t>
             </w:r>
             <w:proofErr w:type="spellStart"/>
-            <w:proofErr w:type="gramStart"/>
             <w:r>
               <w:t>is.null</w:t>
             </w:r>
             <w:proofErr w:type="spellEnd"/>
-            <w:proofErr w:type="gramEnd"/>
           </w:p>
         </w:tc>
         <w:tc>
@@ -962,15 +944,7 @@
           </w:tcPr>
           <w:p>
             <w:r>
-              <w:t xml:space="preserve">returns the type of a vector (or </w:t>
-            </w:r>
-            <w:proofErr w:type="gramStart"/>
-            <w:r>
-              <w:t>other</w:t>
-            </w:r>
-            <w:proofErr w:type="gramEnd"/>
-            <w:r>
-              <w:t xml:space="preserve"> object)</w:t>
+              <w:t>returns the type of a vector (or other object)</w:t>
             </w:r>
           </w:p>
         </w:tc>
@@ -987,42 +961,34 @@
           </w:tcPr>
           <w:p>
             <w:proofErr w:type="spellStart"/>
-            <w:proofErr w:type="gramStart"/>
             <w:r>
               <w:t>is.double</w:t>
             </w:r>
             <w:proofErr w:type="spellEnd"/>
-            <w:proofErr w:type="gramEnd"/>
             <w:r>
               <w:t xml:space="preserve">, </w:t>
             </w:r>
             <w:proofErr w:type="spellStart"/>
-            <w:proofErr w:type="gramStart"/>
             <w:r>
               <w:t>is.integer</w:t>
             </w:r>
             <w:proofErr w:type="spellEnd"/>
-            <w:proofErr w:type="gramEnd"/>
             <w:r>
               <w:t xml:space="preserve">, </w:t>
             </w:r>
             <w:proofErr w:type="spellStart"/>
-            <w:proofErr w:type="gramStart"/>
             <w:r>
               <w:t>is.character</w:t>
             </w:r>
             <w:proofErr w:type="spellEnd"/>
-            <w:proofErr w:type="gramEnd"/>
             <w:r>
               <w:t xml:space="preserve">, </w:t>
             </w:r>
             <w:proofErr w:type="spellStart"/>
-            <w:proofErr w:type="gramStart"/>
             <w:r>
               <w:t>is.logical</w:t>
             </w:r>
             <w:proofErr w:type="spellEnd"/>
-            <w:proofErr w:type="gramEnd"/>
           </w:p>
         </w:tc>
         <w:tc>
@@ -1050,42 +1016,34 @@
           </w:tcPr>
           <w:p>
             <w:proofErr w:type="spellStart"/>
-            <w:proofErr w:type="gramStart"/>
             <w:r>
               <w:t>as.double</w:t>
             </w:r>
             <w:proofErr w:type="spellEnd"/>
-            <w:proofErr w:type="gramEnd"/>
             <w:r>
               <w:t xml:space="preserve">, </w:t>
             </w:r>
             <w:proofErr w:type="spellStart"/>
-            <w:proofErr w:type="gramStart"/>
             <w:r>
               <w:t>as.integer</w:t>
             </w:r>
             <w:proofErr w:type="spellEnd"/>
-            <w:proofErr w:type="gramEnd"/>
             <w:r>
               <w:t xml:space="preserve">, </w:t>
             </w:r>
             <w:proofErr w:type="spellStart"/>
-            <w:proofErr w:type="gramStart"/>
             <w:r>
               <w:t>as.character</w:t>
             </w:r>
             <w:proofErr w:type="spellEnd"/>
-            <w:proofErr w:type="gramEnd"/>
             <w:r>
               <w:t xml:space="preserve">, </w:t>
             </w:r>
             <w:proofErr w:type="spellStart"/>
-            <w:proofErr w:type="gramStart"/>
             <w:r>
               <w:t>as.logical</w:t>
             </w:r>
             <w:proofErr w:type="spellEnd"/>
-            <w:proofErr w:type="gramEnd"/>
           </w:p>
         </w:tc>
         <w:tc>
@@ -1366,23 +1324,7 @@
     <w:p>
       <w:r>
         <w:lastRenderedPageBreak/>
-        <w:t xml:space="preserve">Finally, throughout this chapter, we introduced </w:t>
-      </w:r>
-      <w:proofErr w:type="gramStart"/>
-      <w:r>
-        <w:t>a number of</w:t>
-      </w:r>
-      <w:proofErr w:type="gramEnd"/>
-      <w:r>
-        <w:t xml:space="preserve"> operators. Technically, these are also </w:t>
-      </w:r>
-      <w:proofErr w:type="gramStart"/>
-      <w:r>
-        <w:t>functions</w:t>
-      </w:r>
-      <w:proofErr w:type="gramEnd"/>
-      <w:r>
-        <w:t xml:space="preserve"> but their syntax is quite different. The most important operators that you should know are the following:</w:t>
+        <w:t>Finally, throughout this chapter, we introduced a number of operators. Technically, these are also functions but their syntax is quite different. The most important operators that you should know are the following:</w:t>
       </w:r>
     </w:p>
     <w:tbl>
@@ -1723,13 +1665,8 @@
             <w:hideMark/>
           </w:tcPr>
           <w:p>
-            <w:proofErr w:type="gramStart"/>
-            <w:r>
-              <w:t>&amp;,</w:t>
-            </w:r>
-            <w:proofErr w:type="gramEnd"/>
-            <w:r>
-              <w:t xml:space="preserve"> |</w:t>
+            <w:r>
+              <w:t>&amp;, |</w:t>
             </w:r>
           </w:p>
         </w:tc>
@@ -1749,15 +1686,7 @@
             </w:r>
             <w:proofErr w:type="spellEnd"/>
             <w:r>
-              <w:t xml:space="preserve"> OR (</w:t>
-            </w:r>
-            <w:proofErr w:type="gramStart"/>
-            <w:r>
-              <w:t>element-wise</w:t>
-            </w:r>
-            <w:proofErr w:type="gramEnd"/>
-            <w:r>
-              <w:t>)</w:t>
+              <w:t xml:space="preserve"> OR (element-wise)</w:t>
             </w:r>
           </w:p>
         </w:tc>
@@ -1824,6 +1753,377 @@
           <w:p>
             <w:r>
               <w:t>generate a sequence of numbers</w:t>
+            </w:r>
+          </w:p>
+        </w:tc>
+      </w:tr>
+    </w:tbl>
+    <w:p/>
+    <w:p/>
+    <w:p/>
+    <w:p/>
+    <w:p/>
+    <w:p/>
+    <w:p/>
+    <w:p/>
+    <w:p/>
+    <w:p/>
+    <w:p/>
+    <w:p/>
+    <w:p>
+      <w:r>
+        <w:rPr>
+          <w:b/>
+          <w:bCs/>
+        </w:rPr>
+        <w:t>Vector</w:t>
+      </w:r>
+      <w:r>
+        <w:t xml:space="preserve"> — a single row of values, all the same type. It's the most basic structure in R.</w:t>
+      </w:r>
+    </w:p>
+    <w:p>
+      <w:r>
+        <w:t>r</w:t>
+      </w:r>
+    </w:p>
+    <w:p>
+      <w:r>
+        <w:t># Numeric vector</w:t>
+      </w:r>
+    </w:p>
+    <w:p>
+      <w:r>
+        <w:t>x &lt;- c(1, 2, 3, 4, 5)</w:t>
+      </w:r>
+    </w:p>
+    <w:p/>
+    <w:p>
+      <w:r>
+        <w:t># Character vector</w:t>
+      </w:r>
+    </w:p>
+    <w:p>
+      <w:r>
+        <w:t>names &lt;- c("WT", "M1", "M2")</w:t>
+      </w:r>
+    </w:p>
+    <w:p/>
+    <w:p>
+      <w:r>
+        <w:t># Logical vector</w:t>
+      </w:r>
+    </w:p>
+    <w:p>
+      <w:r>
+        <w:t>passed &lt;- c(TRUE, FALSE, TRUE)</w:t>
+      </w:r>
+    </w:p>
+    <w:p/>
+    <w:p>
+      <w:r>
+        <w:t># Accessing elements</w:t>
+      </w:r>
+    </w:p>
+    <w:p>
+      <w:r>
+        <w:t>x[1]        # returns 1 (R indexing starts at 1, not 0)</w:t>
+      </w:r>
+    </w:p>
+    <w:p>
+      <w:r>
+        <w:t>x[2:4]      # returns 2, 3, 4</w:t>
+      </w:r>
+    </w:p>
+    <w:p>
+      <w:r>
+        <w:rPr>
+          <w:b/>
+          <w:bCs/>
+        </w:rPr>
+        <w:t>Matrix</w:t>
+      </w:r>
+      <w:r>
+        <w:t xml:space="preserve"> — a 2D table of values, all the same type. Think of it as vectors stacked together into rows and columns.</w:t>
+      </w:r>
+    </w:p>
+    <w:p>
+      <w:r>
+        <w:t>r</w:t>
+      </w:r>
+    </w:p>
+    <w:p>
+      <w:r>
+        <w:t># Create a matrix (3 rows, 2 columns)</w:t>
+      </w:r>
+    </w:p>
+    <w:p>
+      <w:r>
+        <w:t xml:space="preserve">m &lt;- matrix(c(1, 2, 3, 4, 5, 6), </w:t>
+      </w:r>
+      <w:proofErr w:type="spellStart"/>
+      <w:r>
+        <w:t>nrow</w:t>
+      </w:r>
+      <w:proofErr w:type="spellEnd"/>
+      <w:r>
+        <w:t xml:space="preserve"> = 3, </w:t>
+      </w:r>
+      <w:proofErr w:type="spellStart"/>
+      <w:r>
+        <w:t>ncol</w:t>
+      </w:r>
+      <w:proofErr w:type="spellEnd"/>
+      <w:r>
+        <w:t xml:space="preserve"> = 2)</w:t>
+      </w:r>
+    </w:p>
+    <w:p/>
+    <w:p>
+      <w:r>
+        <w:t>#      [,1] [,2]</w:t>
+      </w:r>
+    </w:p>
+    <w:p>
+      <w:r>
+        <w:t># [1,]    1    4</w:t>
+      </w:r>
+    </w:p>
+    <w:p>
+      <w:r>
+        <w:t># [2,]    2    5</w:t>
+      </w:r>
+    </w:p>
+    <w:p>
+      <w:r>
+        <w:t># [3,]    3    6</w:t>
+      </w:r>
+    </w:p>
+    <w:p/>
+    <w:p>
+      <w:r>
+        <w:t># Accessing elements [row, column]</w:t>
+      </w:r>
+    </w:p>
+    <w:p>
+      <w:r>
+        <w:t>m[1, 2]     # returns 4 (row 1, column 2)</w:t>
+      </w:r>
+    </w:p>
+    <w:p>
+      <w:r>
+        <w:lastRenderedPageBreak/>
+        <w:t>m[2, ]      # returns entire row 2</w:t>
+      </w:r>
+    </w:p>
+    <w:p>
+      <w:r>
+        <w:t>m[, 1]      # returns entire column 1</w:t>
+      </w:r>
+    </w:p>
+    <w:p>
+      <w:r>
+        <w:rPr>
+          <w:b/>
+          <w:bCs/>
+        </w:rPr>
+        <w:t>Key differences:</w:t>
+      </w:r>
+    </w:p>
+    <w:tbl>
+      <w:tblPr>
+        <w:tblW w:w="0" w:type="auto"/>
+        <w:tblCellSpacing w:w="15" w:type="dxa"/>
+        <w:tblCellMar>
+          <w:top w:w="15" w:type="dxa"/>
+          <w:left w:w="15" w:type="dxa"/>
+          <w:bottom w:w="15" w:type="dxa"/>
+          <w:right w:w="15" w:type="dxa"/>
+        </w:tblCellMar>
+        <w:tblLook w:val="04A0" w:firstRow="1" w:lastRow="0" w:firstColumn="1" w:lastColumn="0" w:noHBand="0" w:noVBand="1"/>
+      </w:tblPr>
+      <w:tblGrid>
+        <w:gridCol w:w="1316"/>
+        <w:gridCol w:w="773"/>
+        <w:gridCol w:w="1226"/>
+      </w:tblGrid>
+      <w:tr>
+        <w:trPr>
+          <w:tblHeader/>
+          <w:tblCellSpacing w:w="15" w:type="dxa"/>
+        </w:trPr>
+        <w:tc>
+          <w:tcPr>
+            <w:tcW w:w="0" w:type="auto"/>
+            <w:vAlign w:val="center"/>
+            <w:hideMark/>
+          </w:tcPr>
+          <w:p/>
+        </w:tc>
+        <w:tc>
+          <w:tcPr>
+            <w:tcW w:w="0" w:type="auto"/>
+            <w:vAlign w:val="center"/>
+            <w:hideMark/>
+          </w:tcPr>
+          <w:p>
+            <w:pPr>
+              <w:rPr>
+                <w:b/>
+                <w:bCs/>
+              </w:rPr>
+            </w:pPr>
+            <w:r>
+              <w:rPr>
+                <w:b/>
+                <w:bCs/>
+              </w:rPr>
+              <w:t>Vector</w:t>
+            </w:r>
+          </w:p>
+        </w:tc>
+        <w:tc>
+          <w:tcPr>
+            <w:tcW w:w="0" w:type="auto"/>
+            <w:vAlign w:val="center"/>
+            <w:hideMark/>
+          </w:tcPr>
+          <w:p>
+            <w:pPr>
+              <w:rPr>
+                <w:b/>
+                <w:bCs/>
+              </w:rPr>
+            </w:pPr>
+            <w:r>
+              <w:rPr>
+                <w:b/>
+                <w:bCs/>
+              </w:rPr>
+              <w:t>Matrix</w:t>
+            </w:r>
+          </w:p>
+        </w:tc>
+      </w:tr>
+      <w:tr>
+        <w:trPr>
+          <w:tblCellSpacing w:w="15" w:type="dxa"/>
+        </w:trPr>
+        <w:tc>
+          <w:tcPr>
+            <w:tcW w:w="0" w:type="auto"/>
+            <w:vAlign w:val="center"/>
+            <w:hideMark/>
+          </w:tcPr>
+          <w:p>
+            <w:r>
+              <w:t>Dimensions</w:t>
+            </w:r>
+          </w:p>
+        </w:tc>
+        <w:tc>
+          <w:tcPr>
+            <w:tcW w:w="0" w:type="auto"/>
+            <w:vAlign w:val="center"/>
+            <w:hideMark/>
+          </w:tcPr>
+          <w:p>
+            <w:r>
+              <w:t>1D</w:t>
+            </w:r>
+          </w:p>
+        </w:tc>
+        <w:tc>
+          <w:tcPr>
+            <w:tcW w:w="0" w:type="auto"/>
+            <w:vAlign w:val="center"/>
+            <w:hideMark/>
+          </w:tcPr>
+          <w:p>
+            <w:r>
+              <w:t>2D</w:t>
+            </w:r>
+          </w:p>
+        </w:tc>
+      </w:tr>
+      <w:tr>
+        <w:trPr>
+          <w:tblCellSpacing w:w="15" w:type="dxa"/>
+        </w:trPr>
+        <w:tc>
+          <w:tcPr>
+            <w:tcW w:w="0" w:type="auto"/>
+            <w:vAlign w:val="center"/>
+            <w:hideMark/>
+          </w:tcPr>
+          <w:p>
+            <w:r>
+              <w:t>Mixed types</w:t>
+            </w:r>
+          </w:p>
+        </w:tc>
+        <w:tc>
+          <w:tcPr>
+            <w:tcW w:w="0" w:type="auto"/>
+            <w:vAlign w:val="center"/>
+            <w:hideMark/>
+          </w:tcPr>
+          <w:p>
+            <w:r>
+              <w:t>No</w:t>
+            </w:r>
+          </w:p>
+        </w:tc>
+        <w:tc>
+          <w:tcPr>
+            <w:tcW w:w="0" w:type="auto"/>
+            <w:vAlign w:val="center"/>
+            <w:hideMark/>
+          </w:tcPr>
+          <w:p>
+            <w:r>
+              <w:t>No</w:t>
+            </w:r>
+          </w:p>
+        </w:tc>
+      </w:tr>
+      <w:tr>
+        <w:trPr>
+          <w:tblCellSpacing w:w="15" w:type="dxa"/>
+        </w:trPr>
+        <w:tc>
+          <w:tcPr>
+            <w:tcW w:w="0" w:type="auto"/>
+            <w:vAlign w:val="center"/>
+            <w:hideMark/>
+          </w:tcPr>
+          <w:p>
+            <w:r>
+              <w:t>Indexing</w:t>
+            </w:r>
+          </w:p>
+        </w:tc>
+        <w:tc>
+          <w:tcPr>
+            <w:tcW w:w="0" w:type="auto"/>
+            <w:vAlign w:val="center"/>
+            <w:hideMark/>
+          </w:tcPr>
+          <w:p>
+            <w:r>
+              <w:t>x[1]</w:t>
+            </w:r>
+          </w:p>
+        </w:tc>
+        <w:tc>
+          <w:tcPr>
+            <w:tcW w:w="0" w:type="auto"/>
+            <w:vAlign w:val="center"/>
+            <w:hideMark/>
+          </w:tcPr>
+          <w:p>
+            <w:r>
+              <w:t>m[row, col]</w:t>
             </w:r>
           </w:p>
         </w:tc>

</xml_diff>